<commit_message>
update ex1 & ex2
</commit_message>
<xml_diff>
--- a/MinhChung.docx
+++ b/MinhChung.docx
@@ -7,21 +7,24 @@
         <w:jc w:val="center"/>
         <w:rPr>
           <w:rFonts w:ascii="Times New Roman" w:hAnsi="Times New Roman" w:cs="Times New Roman"/>
-          <w:sz w:val="26"/>
-          <w:szCs w:val="26"/>
+          <w:sz w:val="32"/>
+          <w:szCs w:val="32"/>
         </w:rPr>
       </w:pPr>
       <w:r>
         <w:rPr>
           <w:rFonts w:ascii="Times New Roman" w:hAnsi="Times New Roman" w:cs="Times New Roman"/>
-          <w:sz w:val="26"/>
-          <w:szCs w:val="26"/>
-        </w:rPr>
-        <w:t>Nguyễn Gia Bảo - 22691861</w:t>
+          <w:b/>
+          <w:bCs/>
+          <w:sz w:val="32"/>
+          <w:szCs w:val="32"/>
+        </w:rPr>
+        <w:t>Kiến trúc và Thiết kế Phần mềm</w:t>
       </w:r>
     </w:p>
     <w:p>
       <w:pPr>
+        <w:jc w:val="center"/>
         <w:rPr>
           <w:rFonts w:ascii="Times New Roman" w:hAnsi="Times New Roman" w:cs="Times New Roman"/>
           <w:sz w:val="26"/>
@@ -34,11 +37,12 @@
           <w:sz w:val="26"/>
           <w:szCs w:val="26"/>
         </w:rPr>
-        <w:t>Bài 1:</w:t>
+        <w:t>DHKTPM18BTT - 422000191402</w:t>
       </w:r>
     </w:p>
     <w:p>
       <w:pPr>
+        <w:jc w:val="center"/>
         <w:rPr>
           <w:rFonts w:ascii="Times New Roman" w:hAnsi="Times New Roman" w:cs="Times New Roman"/>
           <w:sz w:val="26"/>
@@ -48,6 +52,319 @@
       <w:r>
         <w:rPr>
           <w:rFonts w:ascii="Times New Roman" w:hAnsi="Times New Roman" w:cs="Times New Roman"/>
+          <w:sz w:val="26"/>
+          <w:szCs w:val="26"/>
+        </w:rPr>
+        <w:t xml:space="preserve">Nguyễn Gia Bảo </w:t>
+      </w:r>
+      <w:r>
+        <w:rPr>
+          <w:rFonts w:ascii="Times New Roman" w:hAnsi="Times New Roman" w:cs="Times New Roman"/>
+          <w:sz w:val="26"/>
+          <w:szCs w:val="26"/>
+        </w:rPr>
+        <w:t>–</w:t>
+      </w:r>
+      <w:r>
+        <w:rPr>
+          <w:rFonts w:ascii="Times New Roman" w:hAnsi="Times New Roman" w:cs="Times New Roman"/>
+          <w:sz w:val="26"/>
+          <w:szCs w:val="26"/>
+        </w:rPr>
+        <w:t xml:space="preserve"> 22691861</w:t>
+      </w:r>
+      <w:r>
+        <w:rPr>
+          <w:rFonts w:ascii="Times New Roman" w:hAnsi="Times New Roman" w:cs="Times New Roman"/>
+          <w:sz w:val="26"/>
+          <w:szCs w:val="26"/>
+        </w:rPr>
+        <w:t xml:space="preserve"> – 24/01/2026</w:t>
+      </w:r>
+    </w:p>
+    <w:sdt>
+      <w:sdtPr>
+        <w:rPr>
+          <w:rFonts w:ascii="Times New Roman" w:hAnsi="Times New Roman" w:cs="Times New Roman"/>
+        </w:rPr>
+        <w:id w:val="1729872738"/>
+        <w:docPartObj>
+          <w:docPartGallery w:val="Table of Contents"/>
+          <w:docPartUnique/>
+        </w:docPartObj>
+      </w:sdtPr>
+      <w:sdtEndPr>
+        <w:rPr>
+          <w:rFonts w:eastAsiaTheme="minorHAnsi"/>
+          <w:b/>
+          <w:bCs/>
+          <w:noProof/>
+          <w:color w:val="auto"/>
+          <w:kern w:val="2"/>
+          <w:sz w:val="24"/>
+          <w:szCs w:val="24"/>
+          <w14:ligatures w14:val="standardContextual"/>
+        </w:rPr>
+      </w:sdtEndPr>
+      <w:sdtContent>
+        <w:p>
+          <w:pPr>
+            <w:pStyle w:val="TOCHeading"/>
+            <w:rPr>
+              <w:rFonts w:ascii="Times New Roman" w:hAnsi="Times New Roman" w:cs="Times New Roman"/>
+            </w:rPr>
+          </w:pPr>
+          <w:r>
+            <w:rPr>
+              <w:rFonts w:ascii="Times New Roman" w:hAnsi="Times New Roman" w:cs="Times New Roman"/>
+            </w:rPr>
+            <w:t>Mục lục</w:t>
+          </w:r>
+        </w:p>
+        <w:p>
+          <w:pPr>
+            <w:pStyle w:val="TOC2"/>
+            <w:tabs>
+              <w:tab w:val="right" w:leader="dot" w:pos="9350"/>
+            </w:tabs>
+            <w:rPr>
+              <w:rFonts w:ascii="Times New Roman" w:hAnsi="Times New Roman" w:cs="Times New Roman"/>
+              <w:noProof/>
+            </w:rPr>
+          </w:pPr>
+          <w:r>
+            <w:rPr>
+              <w:rFonts w:ascii="Times New Roman" w:hAnsi="Times New Roman" w:cs="Times New Roman"/>
+            </w:rPr>
+            <w:fldChar w:fldCharType="begin"/>
+          </w:r>
+          <w:r>
+            <w:rPr>
+              <w:rFonts w:ascii="Times New Roman" w:hAnsi="Times New Roman" w:cs="Times New Roman"/>
+            </w:rPr>
+            <w:instrText xml:space="preserve"> TOC \o "1-3" \h \z \u </w:instrText>
+          </w:r>
+          <w:r>
+            <w:rPr>
+              <w:rFonts w:ascii="Times New Roman" w:hAnsi="Times New Roman" w:cs="Times New Roman"/>
+            </w:rPr>
+            <w:fldChar w:fldCharType="separate"/>
+          </w:r>
+          <w:hyperlink w:anchor="_Toc220261907" w:history="1">
+            <w:r>
+              <w:rPr>
+                <w:rStyle w:val="Hyperlink"/>
+                <w:rFonts w:ascii="Times New Roman" w:hAnsi="Times New Roman" w:cs="Times New Roman"/>
+                <w:noProof/>
+              </w:rPr>
+              <w:t>1. Bài 1</w:t>
+            </w:r>
+            <w:r>
+              <w:rPr>
+                <w:rFonts w:ascii="Times New Roman" w:hAnsi="Times New Roman" w:cs="Times New Roman"/>
+                <w:noProof/>
+                <w:webHidden/>
+              </w:rPr>
+              <w:tab/>
+            </w:r>
+            <w:r>
+              <w:rPr>
+                <w:rFonts w:ascii="Times New Roman" w:hAnsi="Times New Roman" w:cs="Times New Roman"/>
+                <w:noProof/>
+                <w:webHidden/>
+              </w:rPr>
+              <w:fldChar w:fldCharType="begin"/>
+            </w:r>
+            <w:r>
+              <w:rPr>
+                <w:rFonts w:ascii="Times New Roman" w:hAnsi="Times New Roman" w:cs="Times New Roman"/>
+                <w:noProof/>
+                <w:webHidden/>
+              </w:rPr>
+              <w:instrText xml:space="preserve"> PAGEREF _Toc220261907 \h </w:instrText>
+            </w:r>
+            <w:r>
+              <w:rPr>
+                <w:rFonts w:ascii="Times New Roman" w:hAnsi="Times New Roman" w:cs="Times New Roman"/>
+                <w:noProof/>
+                <w:webHidden/>
+              </w:rPr>
+            </w:r>
+            <w:r>
+              <w:rPr>
+                <w:rFonts w:ascii="Times New Roman" w:hAnsi="Times New Roman" w:cs="Times New Roman"/>
+                <w:noProof/>
+                <w:webHidden/>
+              </w:rPr>
+              <w:fldChar w:fldCharType="separate"/>
+            </w:r>
+            <w:r>
+              <w:rPr>
+                <w:rFonts w:ascii="Times New Roman" w:hAnsi="Times New Roman" w:cs="Times New Roman"/>
+                <w:noProof/>
+                <w:webHidden/>
+              </w:rPr>
+              <w:t>2</w:t>
+            </w:r>
+            <w:r>
+              <w:rPr>
+                <w:rFonts w:ascii="Times New Roman" w:hAnsi="Times New Roman" w:cs="Times New Roman"/>
+                <w:noProof/>
+                <w:webHidden/>
+              </w:rPr>
+              <w:fldChar w:fldCharType="end"/>
+            </w:r>
+          </w:hyperlink>
+        </w:p>
+        <w:p>
+          <w:pPr>
+            <w:pStyle w:val="TOC2"/>
+            <w:tabs>
+              <w:tab w:val="right" w:leader="dot" w:pos="9350"/>
+            </w:tabs>
+            <w:rPr>
+              <w:rFonts w:ascii="Times New Roman" w:hAnsi="Times New Roman" w:cs="Times New Roman"/>
+              <w:noProof/>
+            </w:rPr>
+          </w:pPr>
+          <w:hyperlink w:anchor="_Toc220261908" w:history="1">
+            <w:r>
+              <w:rPr>
+                <w:rStyle w:val="Hyperlink"/>
+                <w:rFonts w:ascii="Times New Roman" w:hAnsi="Times New Roman" w:cs="Times New Roman"/>
+                <w:noProof/>
+              </w:rPr>
+              <w:t>2. Bài 2</w:t>
+            </w:r>
+            <w:r>
+              <w:rPr>
+                <w:rFonts w:ascii="Times New Roman" w:hAnsi="Times New Roman" w:cs="Times New Roman"/>
+                <w:noProof/>
+                <w:webHidden/>
+              </w:rPr>
+              <w:tab/>
+            </w:r>
+            <w:r>
+              <w:rPr>
+                <w:rFonts w:ascii="Times New Roman" w:hAnsi="Times New Roman" w:cs="Times New Roman"/>
+                <w:noProof/>
+                <w:webHidden/>
+              </w:rPr>
+              <w:fldChar w:fldCharType="begin"/>
+            </w:r>
+            <w:r>
+              <w:rPr>
+                <w:rFonts w:ascii="Times New Roman" w:hAnsi="Times New Roman" w:cs="Times New Roman"/>
+                <w:noProof/>
+                <w:webHidden/>
+              </w:rPr>
+              <w:instrText xml:space="preserve"> PAGEREF _Toc220261908 \h </w:instrText>
+            </w:r>
+            <w:r>
+              <w:rPr>
+                <w:rFonts w:ascii="Times New Roman" w:hAnsi="Times New Roman" w:cs="Times New Roman"/>
+                <w:noProof/>
+                <w:webHidden/>
+              </w:rPr>
+            </w:r>
+            <w:r>
+              <w:rPr>
+                <w:rFonts w:ascii="Times New Roman" w:hAnsi="Times New Roman" w:cs="Times New Roman"/>
+                <w:noProof/>
+                <w:webHidden/>
+              </w:rPr>
+              <w:fldChar w:fldCharType="separate"/>
+            </w:r>
+            <w:r>
+              <w:rPr>
+                <w:rFonts w:ascii="Times New Roman" w:hAnsi="Times New Roman" w:cs="Times New Roman"/>
+                <w:noProof/>
+                <w:webHidden/>
+              </w:rPr>
+              <w:t>5</w:t>
+            </w:r>
+            <w:r>
+              <w:rPr>
+                <w:rFonts w:ascii="Times New Roman" w:hAnsi="Times New Roman" w:cs="Times New Roman"/>
+                <w:noProof/>
+                <w:webHidden/>
+              </w:rPr>
+              <w:fldChar w:fldCharType="end"/>
+            </w:r>
+          </w:hyperlink>
+        </w:p>
+        <w:p>
+          <w:pPr>
+            <w:rPr>
+              <w:rFonts w:ascii="Times New Roman" w:hAnsi="Times New Roman" w:cs="Times New Roman"/>
+            </w:rPr>
+          </w:pPr>
+          <w:r>
+            <w:rPr>
+              <w:rFonts w:ascii="Times New Roman" w:hAnsi="Times New Roman" w:cs="Times New Roman"/>
+              <w:b/>
+              <w:bCs/>
+              <w:noProof/>
+            </w:rPr>
+            <w:fldChar w:fldCharType="end"/>
+          </w:r>
+        </w:p>
+      </w:sdtContent>
+    </w:sdt>
+    <w:p>
+      <w:pPr>
+        <w:rPr>
+          <w:rFonts w:ascii="Times New Roman" w:hAnsi="Times New Roman" w:cs="Times New Roman"/>
+          <w:sz w:val="26"/>
+          <w:szCs w:val="26"/>
+        </w:rPr>
+      </w:pPr>
+    </w:p>
+    <w:p>
+      <w:pPr>
+        <w:rPr>
+          <w:rFonts w:ascii="Times New Roman" w:eastAsiaTheme="majorEastAsia" w:hAnsi="Times New Roman" w:cs="Times New Roman"/>
+          <w:color w:val="000000" w:themeColor="text1"/>
+          <w:sz w:val="26"/>
+          <w:szCs w:val="32"/>
+        </w:rPr>
+      </w:pPr>
+      <w:bookmarkStart w:id="0" w:name="_Toc220261907"/>
+      <w:r>
+        <w:rPr>
+          <w:rFonts w:cs="Times New Roman"/>
+        </w:rPr>
+        <w:br w:type="page"/>
+      </w:r>
+    </w:p>
+    <w:p>
+      <w:pPr>
+        <w:pStyle w:val="Heading2"/>
+        <w:rPr>
+          <w:rFonts w:cs="Times New Roman"/>
+        </w:rPr>
+      </w:pPr>
+      <w:r>
+        <w:rPr>
+          <w:rFonts w:cs="Times New Roman"/>
+        </w:rPr>
+        <w:lastRenderedPageBreak/>
+        <w:t>Bài 1</w:t>
+      </w:r>
+      <w:bookmarkEnd w:id="0"/>
+    </w:p>
+    <w:p>
+      <w:pPr>
+        <w:rPr>
+          <w:rFonts w:ascii="Times New Roman" w:hAnsi="Times New Roman" w:cs="Times New Roman"/>
+          <w:sz w:val="26"/>
+          <w:szCs w:val="26"/>
+        </w:rPr>
+      </w:pPr>
+      <w:r>
+        <w:rPr>
+          <w:rFonts w:ascii="Times New Roman" w:hAnsi="Times New Roman" w:cs="Times New Roman"/>
+          <w:noProof/>
           <w:sz w:val="26"/>
           <w:szCs w:val="26"/>
         </w:rPr>
@@ -67,7 +384,7 @@
                     <pic:cNvPicPr/>
                   </pic:nvPicPr>
                   <pic:blipFill>
-                    <a:blip r:embed="rId5"/>
+                    <a:blip r:embed="rId6"/>
                     <a:stretch>
                       <a:fillRect/>
                     </a:stretch>
@@ -99,6 +416,7 @@
       <w:r>
         <w:rPr>
           <w:rFonts w:ascii="Times New Roman" w:hAnsi="Times New Roman" w:cs="Times New Roman"/>
+          <w:noProof/>
           <w:sz w:val="26"/>
           <w:szCs w:val="26"/>
         </w:rPr>
@@ -118,7 +436,7 @@
                     <pic:cNvPicPr/>
                   </pic:nvPicPr>
                   <pic:blipFill>
-                    <a:blip r:embed="rId6"/>
+                    <a:blip r:embed="rId7"/>
                     <a:stretch>
                       <a:fillRect/>
                     </a:stretch>
@@ -159,10 +477,10 @@
       <w:r>
         <w:rPr>
           <w:rFonts w:ascii="Times New Roman" w:hAnsi="Times New Roman" w:cs="Times New Roman"/>
-          <w:sz w:val="26"/>
-          <w:szCs w:val="26"/>
-        </w:rPr>
-        <w:lastRenderedPageBreak/>
+          <w:noProof/>
+          <w:sz w:val="26"/>
+          <w:szCs w:val="26"/>
+        </w:rPr>
         <w:drawing>
           <wp:inline distT="0" distB="0" distL="0" distR="0" wp14:anchorId="4F27F8CD" wp14:editId="70957610">
             <wp:extent cx="5943600" cy="1471930"/>
@@ -179,7 +497,7 @@
                     <pic:cNvPicPr/>
                   </pic:nvPicPr>
                   <pic:blipFill>
-                    <a:blip r:embed="rId7"/>
+                    <a:blip r:embed="rId8"/>
                     <a:stretch>
                       <a:fillRect/>
                     </a:stretch>
@@ -188,6 +506,608 @@
                     <a:xfrm>
                       <a:off x="0" y="0"/>
                       <a:ext cx="5943600" cy="1471930"/>
+                    </a:xfrm>
+                    <a:prstGeom prst="rect">
+                      <a:avLst/>
+                    </a:prstGeom>
+                  </pic:spPr>
+                </pic:pic>
+              </a:graphicData>
+            </a:graphic>
+          </wp:inline>
+        </w:drawing>
+      </w:r>
+    </w:p>
+    <w:p>
+      <w:pPr>
+        <w:rPr>
+          <w:rFonts w:ascii="Times New Roman" w:hAnsi="Times New Roman" w:cs="Times New Roman"/>
+          <w:sz w:val="26"/>
+          <w:szCs w:val="26"/>
+        </w:rPr>
+      </w:pPr>
+      <w:r>
+        <w:rPr>
+          <w:rFonts w:ascii="Times New Roman" w:hAnsi="Times New Roman" w:cs="Times New Roman"/>
+          <w:noProof/>
+          <w:sz w:val="26"/>
+          <w:szCs w:val="26"/>
+        </w:rPr>
+        <w:lastRenderedPageBreak/>
+        <w:drawing>
+          <wp:inline distT="0" distB="0" distL="0" distR="0" wp14:anchorId="5A6EECAF" wp14:editId="74E7B4E9">
+            <wp:extent cx="5943600" cy="3681095"/>
+            <wp:effectExtent l="0" t="0" r="0" b="0"/>
+            <wp:docPr id="1260495256" name="Picture 1"/>
+            <wp:cNvGraphicFramePr>
+              <a:graphicFrameLocks xmlns:a="http://schemas.openxmlformats.org/drawingml/2006/main" noChangeAspect="1"/>
+            </wp:cNvGraphicFramePr>
+            <a:graphic xmlns:a="http://schemas.openxmlformats.org/drawingml/2006/main">
+              <a:graphicData uri="http://schemas.openxmlformats.org/drawingml/2006/picture">
+                <pic:pic xmlns:pic="http://schemas.openxmlformats.org/drawingml/2006/picture">
+                  <pic:nvPicPr>
+                    <pic:cNvPr id="1260495256" name=""/>
+                    <pic:cNvPicPr/>
+                  </pic:nvPicPr>
+                  <pic:blipFill>
+                    <a:blip r:embed="rId9"/>
+                    <a:stretch>
+                      <a:fillRect/>
+                    </a:stretch>
+                  </pic:blipFill>
+                  <pic:spPr>
+                    <a:xfrm>
+                      <a:off x="0" y="0"/>
+                      <a:ext cx="5943600" cy="3681095"/>
+                    </a:xfrm>
+                    <a:prstGeom prst="rect">
+                      <a:avLst/>
+                    </a:prstGeom>
+                  </pic:spPr>
+                </pic:pic>
+              </a:graphicData>
+            </a:graphic>
+          </wp:inline>
+        </w:drawing>
+      </w:r>
+    </w:p>
+    <w:p>
+      <w:pPr>
+        <w:rPr>
+          <w:rFonts w:ascii="Times New Roman" w:hAnsi="Times New Roman" w:cs="Times New Roman"/>
+          <w:sz w:val="26"/>
+          <w:szCs w:val="26"/>
+        </w:rPr>
+      </w:pPr>
+      <w:r>
+        <w:rPr>
+          <w:rFonts w:ascii="Times New Roman" w:hAnsi="Times New Roman" w:cs="Times New Roman"/>
+          <w:noProof/>
+          <w:sz w:val="26"/>
+          <w:szCs w:val="26"/>
+        </w:rPr>
+        <w:drawing>
+          <wp:inline distT="0" distB="0" distL="0" distR="0" wp14:anchorId="717DFEEA" wp14:editId="77777580">
+            <wp:extent cx="5943600" cy="3705225"/>
+            <wp:effectExtent l="0" t="0" r="0" b="9525"/>
+            <wp:docPr id="1114859410" name="Picture 1"/>
+            <wp:cNvGraphicFramePr>
+              <a:graphicFrameLocks xmlns:a="http://schemas.openxmlformats.org/drawingml/2006/main" noChangeAspect="1"/>
+            </wp:cNvGraphicFramePr>
+            <a:graphic xmlns:a="http://schemas.openxmlformats.org/drawingml/2006/main">
+              <a:graphicData uri="http://schemas.openxmlformats.org/drawingml/2006/picture">
+                <pic:pic xmlns:pic="http://schemas.openxmlformats.org/drawingml/2006/picture">
+                  <pic:nvPicPr>
+                    <pic:cNvPr id="1114859410" name=""/>
+                    <pic:cNvPicPr/>
+                  </pic:nvPicPr>
+                  <pic:blipFill>
+                    <a:blip r:embed="rId10"/>
+                    <a:stretch>
+                      <a:fillRect/>
+                    </a:stretch>
+                  </pic:blipFill>
+                  <pic:spPr>
+                    <a:xfrm>
+                      <a:off x="0" y="0"/>
+                      <a:ext cx="5943600" cy="3705225"/>
+                    </a:xfrm>
+                    <a:prstGeom prst="rect">
+                      <a:avLst/>
+                    </a:prstGeom>
+                  </pic:spPr>
+                </pic:pic>
+              </a:graphicData>
+            </a:graphic>
+          </wp:inline>
+        </w:drawing>
+      </w:r>
+    </w:p>
+    <w:p>
+      <w:pPr>
+        <w:rPr>
+          <w:rFonts w:ascii="Times New Roman" w:hAnsi="Times New Roman" w:cs="Times New Roman"/>
+          <w:sz w:val="26"/>
+          <w:szCs w:val="26"/>
+        </w:rPr>
+      </w:pPr>
+      <w:r>
+        <w:rPr>
+          <w:rFonts w:ascii="Times New Roman" w:hAnsi="Times New Roman" w:cs="Times New Roman"/>
+          <w:noProof/>
+          <w:sz w:val="26"/>
+          <w:szCs w:val="26"/>
+        </w:rPr>
+        <w:lastRenderedPageBreak/>
+        <w:drawing>
+          <wp:inline distT="0" distB="0" distL="0" distR="0" wp14:anchorId="7B7FD2B9" wp14:editId="03849EDA">
+            <wp:extent cx="5943600" cy="3707130"/>
+            <wp:effectExtent l="0" t="0" r="0" b="7620"/>
+            <wp:docPr id="574262361" name="Picture 1"/>
+            <wp:cNvGraphicFramePr>
+              <a:graphicFrameLocks xmlns:a="http://schemas.openxmlformats.org/drawingml/2006/main" noChangeAspect="1"/>
+            </wp:cNvGraphicFramePr>
+            <a:graphic xmlns:a="http://schemas.openxmlformats.org/drawingml/2006/main">
+              <a:graphicData uri="http://schemas.openxmlformats.org/drawingml/2006/picture">
+                <pic:pic xmlns:pic="http://schemas.openxmlformats.org/drawingml/2006/picture">
+                  <pic:nvPicPr>
+                    <pic:cNvPr id="574262361" name=""/>
+                    <pic:cNvPicPr/>
+                  </pic:nvPicPr>
+                  <pic:blipFill>
+                    <a:blip r:embed="rId11"/>
+                    <a:stretch>
+                      <a:fillRect/>
+                    </a:stretch>
+                  </pic:blipFill>
+                  <pic:spPr>
+                    <a:xfrm>
+                      <a:off x="0" y="0"/>
+                      <a:ext cx="5943600" cy="3707130"/>
+                    </a:xfrm>
+                    <a:prstGeom prst="rect">
+                      <a:avLst/>
+                    </a:prstGeom>
+                  </pic:spPr>
+                </pic:pic>
+              </a:graphicData>
+            </a:graphic>
+          </wp:inline>
+        </w:drawing>
+      </w:r>
+    </w:p>
+    <w:p>
+      <w:pPr>
+        <w:rPr>
+          <w:rFonts w:ascii="Times New Roman" w:hAnsi="Times New Roman" w:cs="Times New Roman"/>
+          <w:sz w:val="26"/>
+          <w:szCs w:val="26"/>
+        </w:rPr>
+      </w:pPr>
+      <w:r>
+        <w:rPr>
+          <w:rFonts w:ascii="Times New Roman" w:hAnsi="Times New Roman" w:cs="Times New Roman"/>
+          <w:sz w:val="26"/>
+          <w:szCs w:val="26"/>
+        </w:rPr>
+        <w:br w:type="page"/>
+      </w:r>
+    </w:p>
+    <w:p>
+      <w:pPr>
+        <w:pStyle w:val="Heading2"/>
+        <w:rPr>
+          <w:rFonts w:cs="Times New Roman"/>
+        </w:rPr>
+      </w:pPr>
+      <w:bookmarkStart w:id="1" w:name="_Toc220261908"/>
+      <w:r>
+        <w:rPr>
+          <w:rFonts w:cs="Times New Roman"/>
+        </w:rPr>
+        <w:lastRenderedPageBreak/>
+        <w:t>Bài 2</w:t>
+      </w:r>
+      <w:bookmarkEnd w:id="1"/>
+    </w:p>
+    <w:p>
+      <w:pPr>
+        <w:rPr>
+          <w:rFonts w:ascii="Times New Roman" w:hAnsi="Times New Roman" w:cs="Times New Roman"/>
+          <w:sz w:val="26"/>
+          <w:szCs w:val="26"/>
+        </w:rPr>
+      </w:pPr>
+      <w:r>
+        <w:rPr>
+          <w:rFonts w:ascii="Times New Roman" w:hAnsi="Times New Roman" w:cs="Times New Roman"/>
+          <w:noProof/>
+          <w:sz w:val="26"/>
+          <w:szCs w:val="26"/>
+        </w:rPr>
+        <w:drawing>
+          <wp:inline distT="0" distB="0" distL="0" distR="0" wp14:anchorId="36FE128F" wp14:editId="2182B1FC">
+            <wp:extent cx="5943600" cy="3719830"/>
+            <wp:effectExtent l="0" t="0" r="0" b="0"/>
+            <wp:docPr id="592991286" name="Picture 1"/>
+            <wp:cNvGraphicFramePr>
+              <a:graphicFrameLocks xmlns:a="http://schemas.openxmlformats.org/drawingml/2006/main" noChangeAspect="1"/>
+            </wp:cNvGraphicFramePr>
+            <a:graphic xmlns:a="http://schemas.openxmlformats.org/drawingml/2006/main">
+              <a:graphicData uri="http://schemas.openxmlformats.org/drawingml/2006/picture">
+                <pic:pic xmlns:pic="http://schemas.openxmlformats.org/drawingml/2006/picture">
+                  <pic:nvPicPr>
+                    <pic:cNvPr id="592991286" name=""/>
+                    <pic:cNvPicPr/>
+                  </pic:nvPicPr>
+                  <pic:blipFill>
+                    <a:blip r:embed="rId12"/>
+                    <a:stretch>
+                      <a:fillRect/>
+                    </a:stretch>
+                  </pic:blipFill>
+                  <pic:spPr>
+                    <a:xfrm>
+                      <a:off x="0" y="0"/>
+                      <a:ext cx="5943600" cy="3719830"/>
+                    </a:xfrm>
+                    <a:prstGeom prst="rect">
+                      <a:avLst/>
+                    </a:prstGeom>
+                  </pic:spPr>
+                </pic:pic>
+              </a:graphicData>
+            </a:graphic>
+          </wp:inline>
+        </w:drawing>
+      </w:r>
+    </w:p>
+    <w:p>
+      <w:pPr>
+        <w:rPr>
+          <w:rFonts w:ascii="Times New Roman" w:hAnsi="Times New Roman" w:cs="Times New Roman"/>
+          <w:sz w:val="26"/>
+          <w:szCs w:val="26"/>
+        </w:rPr>
+      </w:pPr>
+      <w:r>
+        <w:rPr>
+          <w:rFonts w:ascii="Times New Roman" w:hAnsi="Times New Roman" w:cs="Times New Roman"/>
+          <w:noProof/>
+          <w:sz w:val="26"/>
+          <w:szCs w:val="26"/>
+        </w:rPr>
+        <w:drawing>
+          <wp:inline distT="0" distB="0" distL="0" distR="0" wp14:anchorId="51732453" wp14:editId="51A8A400">
+            <wp:extent cx="5943600" cy="3702050"/>
+            <wp:effectExtent l="0" t="0" r="0" b="0"/>
+            <wp:docPr id="1873223405" name="Picture 1"/>
+            <wp:cNvGraphicFramePr>
+              <a:graphicFrameLocks xmlns:a="http://schemas.openxmlformats.org/drawingml/2006/main" noChangeAspect="1"/>
+            </wp:cNvGraphicFramePr>
+            <a:graphic xmlns:a="http://schemas.openxmlformats.org/drawingml/2006/main">
+              <a:graphicData uri="http://schemas.openxmlformats.org/drawingml/2006/picture">
+                <pic:pic xmlns:pic="http://schemas.openxmlformats.org/drawingml/2006/picture">
+                  <pic:nvPicPr>
+                    <pic:cNvPr id="1873223405" name=""/>
+                    <pic:cNvPicPr/>
+                  </pic:nvPicPr>
+                  <pic:blipFill>
+                    <a:blip r:embed="rId13"/>
+                    <a:stretch>
+                      <a:fillRect/>
+                    </a:stretch>
+                  </pic:blipFill>
+                  <pic:spPr>
+                    <a:xfrm>
+                      <a:off x="0" y="0"/>
+                      <a:ext cx="5943600" cy="3702050"/>
+                    </a:xfrm>
+                    <a:prstGeom prst="rect">
+                      <a:avLst/>
+                    </a:prstGeom>
+                  </pic:spPr>
+                </pic:pic>
+              </a:graphicData>
+            </a:graphic>
+          </wp:inline>
+        </w:drawing>
+      </w:r>
+    </w:p>
+    <w:p>
+      <w:pPr>
+        <w:rPr>
+          <w:rFonts w:ascii="Times New Roman" w:hAnsi="Times New Roman" w:cs="Times New Roman"/>
+          <w:sz w:val="26"/>
+          <w:szCs w:val="26"/>
+        </w:rPr>
+      </w:pPr>
+      <w:r>
+        <w:rPr>
+          <w:rFonts w:ascii="Times New Roman" w:hAnsi="Times New Roman" w:cs="Times New Roman"/>
+          <w:noProof/>
+          <w:sz w:val="26"/>
+          <w:szCs w:val="26"/>
+        </w:rPr>
+        <w:lastRenderedPageBreak/>
+        <w:drawing>
+          <wp:inline distT="0" distB="0" distL="0" distR="0" wp14:anchorId="4139E09E" wp14:editId="0C0C1CE3">
+            <wp:extent cx="5943600" cy="3716655"/>
+            <wp:effectExtent l="0" t="0" r="0" b="0"/>
+            <wp:docPr id="1003130389" name="Picture 1"/>
+            <wp:cNvGraphicFramePr>
+              <a:graphicFrameLocks xmlns:a="http://schemas.openxmlformats.org/drawingml/2006/main" noChangeAspect="1"/>
+            </wp:cNvGraphicFramePr>
+            <a:graphic xmlns:a="http://schemas.openxmlformats.org/drawingml/2006/main">
+              <a:graphicData uri="http://schemas.openxmlformats.org/drawingml/2006/picture">
+                <pic:pic xmlns:pic="http://schemas.openxmlformats.org/drawingml/2006/picture">
+                  <pic:nvPicPr>
+                    <pic:cNvPr id="1003130389" name=""/>
+                    <pic:cNvPicPr/>
+                  </pic:nvPicPr>
+                  <pic:blipFill>
+                    <a:blip r:embed="rId14"/>
+                    <a:stretch>
+                      <a:fillRect/>
+                    </a:stretch>
+                  </pic:blipFill>
+                  <pic:spPr>
+                    <a:xfrm>
+                      <a:off x="0" y="0"/>
+                      <a:ext cx="5943600" cy="3716655"/>
+                    </a:xfrm>
+                    <a:prstGeom prst="rect">
+                      <a:avLst/>
+                    </a:prstGeom>
+                  </pic:spPr>
+                </pic:pic>
+              </a:graphicData>
+            </a:graphic>
+          </wp:inline>
+        </w:drawing>
+      </w:r>
+    </w:p>
+    <w:p>
+      <w:pPr>
+        <w:rPr>
+          <w:rFonts w:ascii="Times New Roman" w:hAnsi="Times New Roman" w:cs="Times New Roman"/>
+          <w:sz w:val="26"/>
+          <w:szCs w:val="26"/>
+        </w:rPr>
+      </w:pPr>
+      <w:r>
+        <w:rPr>
+          <w:rFonts w:ascii="Times New Roman" w:hAnsi="Times New Roman" w:cs="Times New Roman"/>
+          <w:noProof/>
+          <w:sz w:val="26"/>
+          <w:szCs w:val="26"/>
+        </w:rPr>
+        <w:drawing>
+          <wp:inline distT="0" distB="0" distL="0" distR="0" wp14:anchorId="45131BF1" wp14:editId="51E848C4">
+            <wp:extent cx="5943600" cy="3710305"/>
+            <wp:effectExtent l="0" t="0" r="0" b="4445"/>
+            <wp:docPr id="41601453" name="Picture 1"/>
+            <wp:cNvGraphicFramePr>
+              <a:graphicFrameLocks xmlns:a="http://schemas.openxmlformats.org/drawingml/2006/main" noChangeAspect="1"/>
+            </wp:cNvGraphicFramePr>
+            <a:graphic xmlns:a="http://schemas.openxmlformats.org/drawingml/2006/main">
+              <a:graphicData uri="http://schemas.openxmlformats.org/drawingml/2006/picture">
+                <pic:pic xmlns:pic="http://schemas.openxmlformats.org/drawingml/2006/picture">
+                  <pic:nvPicPr>
+                    <pic:cNvPr id="41601453" name=""/>
+                    <pic:cNvPicPr/>
+                  </pic:nvPicPr>
+                  <pic:blipFill>
+                    <a:blip r:embed="rId15"/>
+                    <a:stretch>
+                      <a:fillRect/>
+                    </a:stretch>
+                  </pic:blipFill>
+                  <pic:spPr>
+                    <a:xfrm>
+                      <a:off x="0" y="0"/>
+                      <a:ext cx="5943600" cy="3710305"/>
+                    </a:xfrm>
+                    <a:prstGeom prst="rect">
+                      <a:avLst/>
+                    </a:prstGeom>
+                  </pic:spPr>
+                </pic:pic>
+              </a:graphicData>
+            </a:graphic>
+          </wp:inline>
+        </w:drawing>
+      </w:r>
+    </w:p>
+    <w:p>
+      <w:pPr>
+        <w:rPr>
+          <w:rFonts w:ascii="Times New Roman" w:hAnsi="Times New Roman" w:cs="Times New Roman"/>
+          <w:sz w:val="26"/>
+          <w:szCs w:val="26"/>
+        </w:rPr>
+      </w:pPr>
+    </w:p>
+    <w:p>
+      <w:pPr>
+        <w:rPr>
+          <w:rFonts w:ascii="Times New Roman" w:hAnsi="Times New Roman" w:cs="Times New Roman"/>
+          <w:sz w:val="26"/>
+          <w:szCs w:val="26"/>
+        </w:rPr>
+      </w:pPr>
+      <w:r>
+        <w:rPr>
+          <w:rFonts w:ascii="Times New Roman" w:hAnsi="Times New Roman" w:cs="Times New Roman"/>
+          <w:sz w:val="26"/>
+          <w:szCs w:val="26"/>
+        </w:rPr>
+        <w:br w:type="page"/>
+      </w:r>
+    </w:p>
+    <w:p>
+      <w:pPr>
+        <w:rPr>
+          <w:rFonts w:ascii="Times New Roman" w:hAnsi="Times New Roman" w:cs="Times New Roman"/>
+          <w:sz w:val="26"/>
+          <w:szCs w:val="26"/>
+        </w:rPr>
+      </w:pPr>
+      <w:r>
+        <w:rPr>
+          <w:rFonts w:ascii="Times New Roman" w:hAnsi="Times New Roman" w:cs="Times New Roman"/>
+          <w:sz w:val="26"/>
+          <w:szCs w:val="26"/>
+        </w:rPr>
+        <w:lastRenderedPageBreak/>
+        <w:t>Guest</w:t>
+      </w:r>
+    </w:p>
+    <w:p>
+      <w:pPr>
+        <w:rPr>
+          <w:rFonts w:ascii="Times New Roman" w:hAnsi="Times New Roman" w:cs="Times New Roman"/>
+          <w:sz w:val="26"/>
+          <w:szCs w:val="26"/>
+        </w:rPr>
+      </w:pPr>
+      <w:r>
+        <w:rPr>
+          <w:rFonts w:ascii="Times New Roman" w:hAnsi="Times New Roman" w:cs="Times New Roman"/>
+          <w:noProof/>
+          <w:sz w:val="26"/>
+          <w:szCs w:val="26"/>
+        </w:rPr>
+        <w:drawing>
+          <wp:inline distT="0" distB="0" distL="0" distR="0" wp14:anchorId="76848FBC" wp14:editId="0141EE57">
+            <wp:extent cx="5943600" cy="3708400"/>
+            <wp:effectExtent l="0" t="0" r="0" b="6350"/>
+            <wp:docPr id="2021217671" name="Picture 1"/>
+            <wp:cNvGraphicFramePr>
+              <a:graphicFrameLocks xmlns:a="http://schemas.openxmlformats.org/drawingml/2006/main" noChangeAspect="1"/>
+            </wp:cNvGraphicFramePr>
+            <a:graphic xmlns:a="http://schemas.openxmlformats.org/drawingml/2006/main">
+              <a:graphicData uri="http://schemas.openxmlformats.org/drawingml/2006/picture">
+                <pic:pic xmlns:pic="http://schemas.openxmlformats.org/drawingml/2006/picture">
+                  <pic:nvPicPr>
+                    <pic:cNvPr id="2021217671" name=""/>
+                    <pic:cNvPicPr/>
+                  </pic:nvPicPr>
+                  <pic:blipFill>
+                    <a:blip r:embed="rId16"/>
+                    <a:stretch>
+                      <a:fillRect/>
+                    </a:stretch>
+                  </pic:blipFill>
+                  <pic:spPr>
+                    <a:xfrm>
+                      <a:off x="0" y="0"/>
+                      <a:ext cx="5943600" cy="3708400"/>
+                    </a:xfrm>
+                    <a:prstGeom prst="rect">
+                      <a:avLst/>
+                    </a:prstGeom>
+                  </pic:spPr>
+                </pic:pic>
+              </a:graphicData>
+            </a:graphic>
+          </wp:inline>
+        </w:drawing>
+      </w:r>
+    </w:p>
+    <w:p>
+      <w:pPr>
+        <w:rPr>
+          <w:rFonts w:ascii="Times New Roman" w:hAnsi="Times New Roman" w:cs="Times New Roman"/>
+          <w:sz w:val="26"/>
+          <w:szCs w:val="26"/>
+        </w:rPr>
+      </w:pPr>
+      <w:r>
+        <w:rPr>
+          <w:rFonts w:ascii="Times New Roman" w:hAnsi="Times New Roman" w:cs="Times New Roman"/>
+          <w:noProof/>
+          <w:sz w:val="26"/>
+          <w:szCs w:val="26"/>
+        </w:rPr>
+        <w:drawing>
+          <wp:inline distT="0" distB="0" distL="0" distR="0" wp14:anchorId="60F9C6BC" wp14:editId="76CA4794">
+            <wp:extent cx="5943600" cy="3692525"/>
+            <wp:effectExtent l="0" t="0" r="0" b="3175"/>
+            <wp:docPr id="1897347055" name="Picture 1"/>
+            <wp:cNvGraphicFramePr>
+              <a:graphicFrameLocks xmlns:a="http://schemas.openxmlformats.org/drawingml/2006/main" noChangeAspect="1"/>
+            </wp:cNvGraphicFramePr>
+            <a:graphic xmlns:a="http://schemas.openxmlformats.org/drawingml/2006/main">
+              <a:graphicData uri="http://schemas.openxmlformats.org/drawingml/2006/picture">
+                <pic:pic xmlns:pic="http://schemas.openxmlformats.org/drawingml/2006/picture">
+                  <pic:nvPicPr>
+                    <pic:cNvPr id="1897347055" name=""/>
+                    <pic:cNvPicPr/>
+                  </pic:nvPicPr>
+                  <pic:blipFill>
+                    <a:blip r:embed="rId17"/>
+                    <a:stretch>
+                      <a:fillRect/>
+                    </a:stretch>
+                  </pic:blipFill>
+                  <pic:spPr>
+                    <a:xfrm>
+                      <a:off x="0" y="0"/>
+                      <a:ext cx="5943600" cy="3692525"/>
+                    </a:xfrm>
+                    <a:prstGeom prst="rect">
+                      <a:avLst/>
+                    </a:prstGeom>
+                  </pic:spPr>
+                </pic:pic>
+              </a:graphicData>
+            </a:graphic>
+          </wp:inline>
+        </w:drawing>
+      </w:r>
+    </w:p>
+    <w:p>
+      <w:pPr>
+        <w:rPr>
+          <w:rFonts w:ascii="Times New Roman" w:hAnsi="Times New Roman" w:cs="Times New Roman"/>
+          <w:sz w:val="26"/>
+          <w:szCs w:val="26"/>
+        </w:rPr>
+      </w:pPr>
+      <w:r>
+        <w:rPr>
+          <w:rFonts w:ascii="Times New Roman" w:hAnsi="Times New Roman" w:cs="Times New Roman"/>
+          <w:noProof/>
+          <w:sz w:val="26"/>
+          <w:szCs w:val="26"/>
+        </w:rPr>
+        <w:lastRenderedPageBreak/>
+        <w:drawing>
+          <wp:inline distT="0" distB="0" distL="0" distR="0" wp14:anchorId="6BFB91D8" wp14:editId="7117E2EF">
+            <wp:extent cx="5943600" cy="3706495"/>
+            <wp:effectExtent l="0" t="0" r="0" b="8255"/>
+            <wp:docPr id="237047432" name="Picture 1"/>
+            <wp:cNvGraphicFramePr>
+              <a:graphicFrameLocks xmlns:a="http://schemas.openxmlformats.org/drawingml/2006/main" noChangeAspect="1"/>
+            </wp:cNvGraphicFramePr>
+            <a:graphic xmlns:a="http://schemas.openxmlformats.org/drawingml/2006/main">
+              <a:graphicData uri="http://schemas.openxmlformats.org/drawingml/2006/picture">
+                <pic:pic xmlns:pic="http://schemas.openxmlformats.org/drawingml/2006/picture">
+                  <pic:nvPicPr>
+                    <pic:cNvPr id="237047432" name=""/>
+                    <pic:cNvPicPr/>
+                  </pic:nvPicPr>
+                  <pic:blipFill>
+                    <a:blip r:embed="rId18"/>
+                    <a:stretch>
+                      <a:fillRect/>
+                    </a:stretch>
+                  </pic:blipFill>
+                  <pic:spPr>
+                    <a:xfrm>
+                      <a:off x="0" y="0"/>
+                      <a:ext cx="5943600" cy="3706495"/>
                     </a:xfrm>
                     <a:prstGeom prst="rect">
                       <a:avLst/>
@@ -1334,6 +2254,68 @@
       <w:spacing w:val="5"/>
     </w:rPr>
   </w:style>
+  <w:style w:type="character" w:styleId="Hyperlink">
+    <w:name w:val="Hyperlink"/>
+    <w:basedOn w:val="DefaultParagraphFont"/>
+    <w:uiPriority w:val="99"/>
+    <w:unhideWhenUsed/>
+    <w:rsid w:val="001E6BFB"/>
+    <w:rPr>
+      <w:color w:val="467886" w:themeColor="hyperlink"/>
+      <w:u w:val="single"/>
+    </w:rPr>
+  </w:style>
+  <w:style w:type="character" w:styleId="UnresolvedMention">
+    <w:name w:val="Unresolved Mention"/>
+    <w:basedOn w:val="DefaultParagraphFont"/>
+    <w:uiPriority w:val="99"/>
+    <w:semiHidden/>
+    <w:unhideWhenUsed/>
+    <w:rsid w:val="001E6BFB"/>
+    <w:rPr>
+      <w:color w:val="605E5C"/>
+      <w:shd w:val="clear" w:color="auto" w:fill="E1DFDD"/>
+    </w:rPr>
+  </w:style>
+  <w:style w:type="paragraph" w:styleId="TOCHeading">
+    <w:name w:val="TOC Heading"/>
+    <w:basedOn w:val="Heading1"/>
+    <w:next w:val="Normal"/>
+    <w:uiPriority w:val="39"/>
+    <w:unhideWhenUsed/>
+    <w:qFormat/>
+    <w:rsid w:val="0057794C"/>
+    <w:pPr>
+      <w:numPr>
+        <w:numId w:val="0"/>
+      </w:numPr>
+      <w:spacing w:before="240" w:after="0" w:line="259" w:lineRule="auto"/>
+      <w:contextualSpacing w:val="0"/>
+      <w:outlineLvl w:val="9"/>
+    </w:pPr>
+    <w:rPr>
+      <w:rFonts w:asciiTheme="majorHAnsi" w:hAnsiTheme="majorHAnsi"/>
+      <w:b w:val="0"/>
+      <w:color w:val="0F4761" w:themeColor="accent1" w:themeShade="BF"/>
+      <w:kern w:val="0"/>
+      <w:sz w:val="32"/>
+      <w:szCs w:val="32"/>
+      <w14:ligatures w14:val="none"/>
+    </w:rPr>
+  </w:style>
+  <w:style w:type="paragraph" w:styleId="TOC2">
+    <w:name w:val="toc 2"/>
+    <w:basedOn w:val="Normal"/>
+    <w:next w:val="Normal"/>
+    <w:autoRedefine/>
+    <w:uiPriority w:val="39"/>
+    <w:unhideWhenUsed/>
+    <w:rsid w:val="0057794C"/>
+    <w:pPr>
+      <w:spacing w:after="100"/>
+      <w:ind w:left="240"/>
+    </w:pPr>
+  </w:style>
 </w:styles>
 </file>
 
@@ -1630,4 +2612,16 @@
     </a:ext>
   </a:extLst>
 </a:theme>
+</file>
+
+<file path=customXml/item1.xml><?xml version="1.0" encoding="utf-8"?>
+<b:Sources xmlns:b="http://schemas.openxmlformats.org/officeDocument/2006/bibliography" xmlns="http://schemas.openxmlformats.org/officeDocument/2006/bibliography" SelectedStyle="\APASixthEditionOfficeOnline.xsl" StyleName="APA" Version="6"/>
+</file>
+
+<file path=customXml/itemProps1.xml><?xml version="1.0" encoding="utf-8"?>
+<ds:datastoreItem xmlns:ds="http://schemas.openxmlformats.org/officeDocument/2006/customXml" ds:itemID="{858BDADD-60EA-4F24-B61E-BBEE9B44B25D}">
+  <ds:schemaRefs>
+    <ds:schemaRef ds:uri="http://schemas.openxmlformats.org/officeDocument/2006/bibliography"/>
+  </ds:schemaRefs>
+</ds:datastoreItem>
 </file>
</xml_diff>